<commit_message>
Ausbau-Runde: Gruppe 27 (Zwischenstand)
Co-Authored-By: Claude Fable 5 <noreply@anthropic.com>
Claude-Session: https://claude.ai/code/session_01YXnmkjavncPDoNYycYaC5G
</commit_message>
<xml_diff>
--- a/testakten/beamtenrecht-schulleitung-hannover-konkurrentenstreit/20_zwischennachricht_vg_hannover.docx
+++ b/testakten/beamtenrecht-schulleitung-hannover-konkurrentenstreit/20_zwischennachricht_vg_hannover.docx
@@ -126,13 +126,100 @@
       </w:r>
     </w:p>
     <w:sectPr>
+      <w:headerReference w:type="default" r:id="rId9"/>
+      <w:footerReference w:type="default" r:id="rId10"/>
       <w:pgSz w:w="11906" w:h="16838"/>
-      <w:pgMar w:top="1417" w:right="1417" w:bottom="1417" w:left="1417" w:header="720" w:footer="720" w:gutter="0"/>
+      <w:pgMar w:top="1417" w:right="1417" w:bottom="1417" w:left="1417" w:header="680" w:footer="567" w:gutter="0"/>
       <w:cols w:space="720"/>
       <w:docGrid w:linePitch="360"/>
     </w:sectPr>
   </w:body>
 </w:document>
+</file>
+
+<file path=word/footer1.xml><?xml version="1.0" encoding="utf-8"?>
+<w:ftr xmlns:m="http://schemas.openxmlformats.org/officeDocument/2006/math" xmlns:mc="http://schemas.openxmlformats.org/markup-compatibility/2006" xmlns:mo="http://schemas.microsoft.com/office/mac/office/2008/main" xmlns:mv="urn:schemas-microsoft-com:mac:vml" xmlns:o="urn:schemas-microsoft-com:office:office" xmlns:r="http://schemas.openxmlformats.org/officeDocument/2006/relationships" xmlns:v="urn:schemas-microsoft-com:vml" xmlns:w10="urn:schemas-microsoft-com:office:word" xmlns:w14="http://schemas.microsoft.com/office/word/2010/wordml" xmlns:w="http://schemas.openxmlformats.org/wordprocessingml/2006/main" xmlns:wne="http://schemas.microsoft.com/office/word/2006/wordml" xmlns:wp14="http://schemas.microsoft.com/office/word/2010/wordprocessingDrawing" xmlns:wp="http://schemas.openxmlformats.org/drawingml/2006/wordprocessingDrawing" xmlns:wpc="http://schemas.microsoft.com/office/word/2010/wordprocessingCanvas" xmlns:wpg="http://schemas.microsoft.com/office/word/2010/wordprocessingGroup" xmlns:wpi="http://schemas.microsoft.com/office/word/2010/wordprocessingInk" xmlns:wps="http://schemas.microsoft.com/office/word/2010/wordprocessingShape" mc:Ignorable="w14 wp14">
+  <w:p>
+    <w:pPr>
+      <w:pStyle w:val="Footer"/>
+      <w:tabs>
+        <w:tab w:pos="9071" w:val="right"/>
+      </w:tabs>
+      <w:jc w:val="left"/>
+    </w:pPr>
+    <w:r>
+      <w:rPr>
+        <w:rFonts w:ascii="Times New Roman" w:hAnsi="Times New Roman"/>
+        <w:color w:val="6B6B66"/>
+        <w:sz w:val="16"/>
+      </w:rPr>
+    </w:r>
+    <w:r>
+      <w:rPr>
+        <w:rFonts w:ascii="Times New Roman" w:hAnsi="Times New Roman"/>
+        <w:color w:val="6B6B66"/>
+        <w:sz w:val="16"/>
+      </w:rPr>
+      <w:t>Verwaltungsgericht Hannover</w:t>
+    </w:r>
+    <w:r>
+      <w:rPr>
+        <w:rFonts w:ascii="Times New Roman" w:hAnsi="Times New Roman"/>
+        <w:color w:val="6B6B66"/>
+        <w:sz w:val="16"/>
+      </w:rPr>
+      <w:tab/>
+      <w:t xml:space="preserve">Seite </w:t>
+    </w:r>
+    <w:r>
+      <w:rPr>
+        <w:rFonts w:ascii="Times New Roman" w:hAnsi="Times New Roman"/>
+        <w:color w:val="6B6B66"/>
+        <w:sz w:val="16"/>
+      </w:rPr>
+      <w:fldChar w:fldCharType="begin"/>
+      <w:instrText xml:space="preserve"> PAGE </w:instrText>
+      <w:fldChar w:fldCharType="end"/>
+    </w:r>
+  </w:p>
+</w:ftr>
+</file>
+
+<file path=word/header1.xml><?xml version="1.0" encoding="utf-8"?>
+<w:hdr xmlns:m="http://schemas.openxmlformats.org/officeDocument/2006/math" xmlns:mc="http://schemas.openxmlformats.org/markup-compatibility/2006" xmlns:mo="http://schemas.microsoft.com/office/mac/office/2008/main" xmlns:mv="urn:schemas-microsoft-com:mac:vml" xmlns:o="urn:schemas-microsoft-com:office:office" xmlns:r="http://schemas.openxmlformats.org/officeDocument/2006/relationships" xmlns:v="urn:schemas-microsoft-com:vml" xmlns:w10="urn:schemas-microsoft-com:office:word" xmlns:w14="http://schemas.microsoft.com/office/word/2010/wordml" xmlns:w="http://schemas.openxmlformats.org/wordprocessingml/2006/main" xmlns:wne="http://schemas.microsoft.com/office/word/2006/wordml" xmlns:wp14="http://schemas.microsoft.com/office/word/2010/wordprocessingDrawing" xmlns:wp="http://schemas.openxmlformats.org/drawingml/2006/wordprocessingDrawing" xmlns:wpc="http://schemas.microsoft.com/office/word/2010/wordprocessingCanvas" xmlns:wpg="http://schemas.microsoft.com/office/word/2010/wordprocessingGroup" xmlns:wpi="http://schemas.microsoft.com/office/word/2010/wordprocessingInk" xmlns:wps="http://schemas.microsoft.com/office/word/2010/wordprocessingShape" mc:Ignorable="w14 wp14">
+  <w:p>
+    <w:pPr>
+      <w:pStyle w:val="Header"/>
+      <w:jc w:val="left"/>
+    </w:pPr>
+    <w:r/>
+    <w:r>
+      <w:rPr>
+        <w:rFonts w:ascii="Times New Roman" w:hAnsi="Times New Roman"/>
+        <w:b/>
+        <w:color w:val="3B3F45"/>
+        <w:sz w:val="24"/>
+      </w:rPr>
+      <w:t>Verwaltungsgericht Hannover</w:t>
+    </w:r>
+  </w:p>
+  <w:p>
+    <w:pPr>
+      <w:jc w:val="left"/>
+      <w:pBdr>
+        <w:bottom w:val="single" w:sz="6" w:space="2" w:color="3B3F45"/>
+      </w:pBdr>
+    </w:pPr>
+    <w:r>
+      <w:rPr>
+        <w:rFonts w:ascii="Times New Roman" w:hAnsi="Times New Roman"/>
+        <w:color w:val="6B6B66"/>
+        <w:sz w:val="16"/>
+      </w:rPr>
+      <w:t>Gericht · Aktenzeichen: 2 B 2647/26</w:t>
+    </w:r>
+  </w:p>
+</w:hdr>
 </file>
 
 <file path=word/numbering.xml><?xml version="1.0" encoding="utf-8"?>

</xml_diff>